<commit_message>
Trim deck to 10 slides; move speech out of slides
Fold standalone "why SAR" slide into the data slide as a compact
why-radar + look-alikes band, and merge novelty/comparison/conclusions
into one closing slide. Remove embedded speaker notes (speech lives only
in Речь_к_защите_2026.docx, one section per slide). Keep fade transitions.

https://claude.ai/code/session_019hNMUj3P61dTB8aYHXMjHP
</commit_message>
<xml_diff>
--- a/thesis/presentation/Речь_к_защите_2026.docx
+++ b/thesis/presentation/Речь_к_защите_2026.docx
@@ -25,7 +25,7 @@
           <w:i/>
           <w:sz w:val="22"/>
         </w:rPr>
-        <w:t>Детектирование нефтяных разливов в арктических портах по данным Sentinel-1  ·  ≈ 6–7 минут</w:t>
+        <w:t>Детектирование нефтяных разливов в арктических портах по данным Sentinel-1  ·  ≈ 6 минут</w:t>
       </w:r>
     </w:p>
     <w:p/>
@@ -53,7 +53,7 @@
           <w:rFonts w:ascii="Times New Roman" w:hAnsi="Times New Roman"/>
           <w:sz w:val="26"/>
         </w:rPr>
-        <w:t>Здравствуйте! Тема моей работы — разработка системы автоматического детектирования нефтяных разливов в акваториях арктических портов по данным спутниковой радиолокации. Научный руководитель — кандидат технических наук, доцент Митько Арсений Валерьевич.</w:t>
+        <w:t>Здравствуйте, уважаемые члены комиссии! Тема моей работы — разработка системы автоматического детектирования нефтяных разливов в акваториях арктических портов по данным спутниковой радиолокации. Научный руководитель — кандидат технических наук, доцент Митько Арсений Валерьевич.</w:t>
       </w:r>
     </w:p>
     <w:p>
@@ -80,7 +80,7 @@
           <w:rFonts w:ascii="Times New Roman" w:hAnsi="Times New Roman"/>
           <w:sz w:val="26"/>
         </w:rPr>
-        <w:t>Цель работы — создать и проверить систему, которая по радарным снимкам Sentinel-1 автоматически находит нефтяные разливы и при этом не путает их с похожими тёмными пятнами. Для этого я решил пять задач: от изучения физики радиолокации и сбора датасета до обучения нейросети и проверки её на новых портах.</w:t>
+        <w:t>Цель работы — создать и проверить систему, которая по радарным снимкам Sentinel-1 автоматически находит нефтяные разливы и при этом не путает их с похожими тёмными пятнами. Для достижения цели я поставил пять задач: изучить физику радиолокации нефти и систематизировать ложные цели; реализовать конвейер предобработки снимков; собрать трёхклассовый датасет; адаптировать и обучить нейросеть DeepLabV3+; и проверить перенос модели на новые порты со сравнением с аналогами.</w:t>
       </w:r>
     </w:p>
     <w:p>
@@ -107,7 +107,7 @@
           <w:rFonts w:ascii="Times New Roman" w:hAnsi="Times New Roman"/>
           <w:sz w:val="26"/>
         </w:rPr>
-        <w:t>Почему это важно. Ежегодно в Мировой океан попадает более 700 тысяч тонн нефти, а в холодной арктической воде она разлагается в 5–10 раз медленнее. При этом оптические спутники тут почти бесполезны: больше 80 процентов времени мешают облака и полярная ночь. Два показательных случая — разлив в Кольском заливе в 2024 году и крупнейшая авария в Норильске в 2020-м, когда вылилось около 21 тысячи тонн дизтоплива.</w:t>
+        <w:t>Почему эта тема актуальна. Ежегодно в Мировой океан попадает более 700 тысяч тонн нефти, а в холодной арктической воде она разлагается в 5–10 раз медленнее, поэтому ущерб особенно велик. При этом оптические спутники здесь почти бесполезны: больше 80 процентов времени мешают облака и полярная ночь. Два показательных случая в российской Арктике — разлив в Кольском заливе в августе 2024 года и крупнейшая авария в Норильске в 2020-м, когда вылилось около 21 тысячи тонн дизтоплива со штрафом 146 миллиардов рублей.</w:t>
       </w:r>
     </w:p>
     <w:p>
@@ -121,7 +121,7 @@
           <w:color w:val="1E3A5F"/>
           <w:sz w:val="24"/>
         </w:rPr>
-        <w:t>Слайд 4 — Почему радар (SAR)</w:t>
+        <w:t>Слайд 4 — Данные и метод</w:t>
       </w:r>
     </w:p>
     <w:p>
@@ -134,7 +134,7 @@
           <w:rFonts w:ascii="Times New Roman" w:hAnsi="Times New Roman"/>
           <w:sz w:val="26"/>
         </w:rPr>
-        <w:t>Почему именно радар. Нефть гасит мелкую рябь на воде — это эффект Марангони — и на радарном снимке появляется тёмное пятно. Радар Sentinel-1 работает круглосуточно и сквозь облака, а данные бесплатны. Главная сложность — отличить нефть от похожих тёмных пятен: молодого льда, штиля и биоплёнок. Для этого я использую разность поляризаций и отдельный класс льда.</w:t>
+        <w:t>Решение — радиолокация. Радар Sentinel-1 работает круглосуточно и сквозь облака, а данные бесплатны. Физика простая: нефть гасит мелкую рябь на воде — это эффект Марангони — и на снимке появляется тёмное пятно. Главная сложность в том, что такие же тёмные пятна дают молодой лёд, зоны штиля и биоплёнки — это ложные цели; до 70 процентов тёмных пятен в Арктике это лёд, а не нефть. Поэтому я собрал датасет из 1125 сцен с разрешением 10 метров и разметил его на три класса — вода, нефть и лёд с сушей, впервые выделив лёд в отдельный класс. Источник данных — Copernicus, ESA.</w:t>
       </w:r>
     </w:p>
     <w:p>
@@ -148,7 +148,7 @@
           <w:color w:val="1E3A5F"/>
           <w:sz w:val="24"/>
         </w:rPr>
-        <w:t>Слайд 5 — Данные и датасет</w:t>
+        <w:t>Слайд 5 — Кейс 1: Кольский залив</w:t>
       </w:r>
     </w:p>
     <w:p>
@@ -161,7 +161,7 @@
           <w:rFonts w:ascii="Times New Roman" w:hAnsi="Times New Roman"/>
           <w:sz w:val="26"/>
         </w:rPr>
-        <w:t>Данные. Я использовал бесплатные радарные снимки Sentinel-1 с разрешением 10 метров. На их основе собрал размеченный датасет из 1125 сцен и более 4 тысяч фрагментов, разделив их на три класса: вода, нефть и лёд с сушей. Отдельный класс льда — принципиально важен для Арктики. Источник данных — Copernicus, ESA; базовый датасет — MKLab.</w:t>
+        <w:t>Первый и основной кейс — Кольский залив, главный нефтяной узел западной Арктики. В августе 2024 года при бункеровке судна произошла утечка топлива. Sentinel-1 зафиксировал тёмное пятно, занявшее около 14 процентов акватории. Чтобы убедиться, что это именно нефть, а не двойник, я применил двойную проверку: метеоданные ERA5 показали рабочий ветер 4.8 метра в секунду, а данные судового трафика AIS подтвердили суда в зоне в момент съёмки.</w:t>
       </w:r>
     </w:p>
     <w:p>
@@ -175,7 +175,7 @@
           <w:color w:val="1E3A5F"/>
           <w:sz w:val="24"/>
         </w:rPr>
-        <w:t>Слайд 6 — Кейс 1: Кольский залив</w:t>
+        <w:t>Слайд 6 — Кейс 2: Варандей и Печенга</w:t>
       </w:r>
     </w:p>
     <w:p>
@@ -188,7 +188,7 @@
           <w:rFonts w:ascii="Times New Roman" w:hAnsi="Times New Roman"/>
           <w:sz w:val="26"/>
         </w:rPr>
-        <w:t>Первый и основной кейс — Кольский залив, главный нефтяной узел западной Арктики. В августе 2024 года при бункеровке судна произошла утечка топлива. Sentinel-1 зафиксировал тёмное пятно, занявшее около 14 процентов акватории. Чтобы убедиться, что это нефть, а не двойник, я применил двойную проверку: метеоданные ERA5 показали рабочий ветер, а данные AIS подтвердили суда в зоне в момент съёмки.</w:t>
+        <w:t>Далее я проверил метод на новых портах — слева нефтеналивной терминал Варандей, справа порт Печенга. На обоих снимках видны тёмные аномалии, которые система выделяет автоматически. Все снимки — Sentinel-1, ESA.</w:t>
       </w:r>
     </w:p>
     <w:p>
@@ -202,7 +202,7 @@
           <w:color w:val="1E3A5F"/>
           <w:sz w:val="24"/>
         </w:rPr>
-        <w:t>Слайд 7 — Кейс 2: Варандей и Печенга</w:t>
+        <w:t>Слайд 7 — Кейс 3: Сабетта и Норильск</w:t>
       </w:r>
     </w:p>
     <w:p>
@@ -215,7 +215,7 @@
           <w:rFonts w:ascii="Times New Roman" w:hAnsi="Times New Roman"/>
           <w:sz w:val="26"/>
         </w:rPr>
-        <w:t>Затем я проверил метод на новых портах — Варандей и Печенга. Слева — нефтеналивной терминал Варандей, справа — порт Печенга. На обоих снимках видны тёмные аномалии, которые система выделяет автоматически. Все снимки — Sentinel-1, ESA.</w:t>
+        <w:t>Третий блок — Сабетта, ворота арктического СПГ, и мотивирующий случай Норильска. Здесь важно быть честным перед комиссией: разлив в Норильске произошёл на суше и в реках, поэтому его отслеживали по оптике Sentinel-2, а радар показывает ледовую обстановку, а не саму плёнку нефти. Этот случай как раз объясняет, зачем нужен надёжный всепогодный мониторинг.</w:t>
       </w:r>
     </w:p>
     <w:p>
@@ -229,7 +229,7 @@
           <w:color w:val="1E3A5F"/>
           <w:sz w:val="24"/>
         </w:rPr>
-        <w:t>Слайд 8 — Кейс 3: Сабетта и Норильск</w:t>
+        <w:t>Слайд 8 — Модель DeepLabV3+</w:t>
       </w:r>
     </w:p>
     <w:p>
@@ -242,7 +242,7 @@
           <w:rFonts w:ascii="Times New Roman" w:hAnsi="Times New Roman"/>
           <w:sz w:val="26"/>
         </w:rPr>
-        <w:t>Третий блок — Сабетта, ворота арктического СПГ, и мотивирующий случай Норильска. Здесь важно быть честным: разлив в Норильске произошёл на суше и в реках, поэтому его отслеживали по оптике Sentinel-2, а радар показывает ледовую обстановку, а не саму плёнку. Этот случай объясняет, зачем вообще нужен надёжный спутниковый мониторинг Арктики.</w:t>
+        <w:t>Для автоматического распознавания я адаптировал нейросеть DeepLabV3+. Энкодер ResNet-50 перестроен под одноканальные радарные данные, блок ASPP улавливает объекты разного масштаба, а блоки внимания scSE подавляют шум и усиливают нефтяные пятна. Поскольку нефти на снимках очень мало, обучение шло с балансировкой классов и комбинированной функцией потерь Dice-BCE.</w:t>
       </w:r>
     </w:p>
     <w:p>
@@ -256,7 +256,7 @@
           <w:color w:val="1E3A5F"/>
           <w:sz w:val="24"/>
         </w:rPr>
-        <w:t>Слайд 9 — Модель DeepLabV3+</w:t>
+        <w:t>Слайд 9 — Результаты модели</w:t>
       </w:r>
     </w:p>
     <w:p>
@@ -269,7 +269,7 @@
           <w:rFonts w:ascii="Times New Roman" w:hAnsi="Times New Roman"/>
           <w:sz w:val="26"/>
         </w:rPr>
-        <w:t>Для автоматического распознавания я адаптировал нейросеть DeepLabV3+. Энкодер ResNet-50 я перестроил под одноканальные радарные данные, блок ASPP улавливает объекты разного масштаба, а блоки внимания scSE подавляют шум и усиливают нефтяные пятна. Обучение шло с балансировкой классов, потому что нефти на снимках очень мало.</w:t>
+        <w:t>Главные результаты. На Кольском заливе модель достигла точности 95.8 процента, mIoU 0.82 и F1 по нефти 0.89. Кривые обучения слева показывают устойчивую сходимость без переобучения. При переносе на другие порты без дообучения качество ожидаемо снижается: Варандей — 0.84, Сабетта — 0.76. Я количественно оценил эту деградацию — это один из ключевых результатов работы.</w:t>
       </w:r>
     </w:p>
     <w:p>
@@ -283,7 +283,7 @@
           <w:color w:val="1E3A5F"/>
           <w:sz w:val="24"/>
         </w:rPr>
-        <w:t>Слайд 10 — Результаты модели</w:t>
+        <w:t>Слайд 10 — Новизна, сравнение и выводы</w:t>
       </w:r>
     </w:p>
     <w:p>
@@ -296,61 +296,7 @@
           <w:rFonts w:ascii="Times New Roman" w:hAnsi="Times New Roman"/>
           <w:sz w:val="26"/>
         </w:rPr>
-        <w:t>Главные результаты. На Кольском заливе модель достигла точности 95.8 процента, mIoU 0.82 и F1 по нефти 0.89. Кривые обучения слева показывают устойчивую сходимость без переобучения. При переносе на другие порты без дообучения качество ожидаемо снижается: Варандей — 0.84, Сабетта — 0.76. Я количественно оценил эту деградацию — это и есть один из ключевых результатов.</w:t>
-      </w:r>
-    </w:p>
-    <w:p>
-      <w:pPr>
-        <w:spacing w:before="160" w:after="40"/>
-      </w:pPr>
-      <w:r>
-        <w:rPr>
-          <w:rFonts w:ascii="Times New Roman" w:hAnsi="Times New Roman"/>
-          <w:b/>
-          <w:color w:val="1E3A5F"/>
-          <w:sz w:val="24"/>
-        </w:rPr>
-        <w:t>Слайд 11 — Новизна и сравнение</w:t>
-      </w:r>
-    </w:p>
-    <w:p>
-      <w:pPr>
-        <w:spacing w:line="312" w:lineRule="auto" w:after="80"/>
-        <w:jc w:val="both"/>
-      </w:pPr>
-      <w:r>
-        <w:rPr>
-          <w:rFonts w:ascii="Times New Roman" w:hAnsi="Times New Roman"/>
-          <w:sz w:val="26"/>
-        </w:rPr>
-        <w:t>Научная новизна — в трёх вещах. Первое: первый трёхклассовый датасет для российской Арктики, где лёд выделен в отдельный класс. Второе: адаптация DeepLabV3+ под одноканальные радарные данные. Третье: первая количественная оценка переноса модели между портами. По метрике F1 мой метод превосходит все аналоги из литературы — это видно на графике справа.</w:t>
-      </w:r>
-    </w:p>
-    <w:p>
-      <w:pPr>
-        <w:spacing w:before="160" w:after="40"/>
-      </w:pPr>
-      <w:r>
-        <w:rPr>
-          <w:rFonts w:ascii="Times New Roman" w:hAnsi="Times New Roman"/>
-          <w:b/>
-          <w:color w:val="1E3A5F"/>
-          <w:sz w:val="24"/>
-        </w:rPr>
-        <w:t>Слайд 12 — Выводы</w:t>
-      </w:r>
-    </w:p>
-    <w:p>
-      <w:pPr>
-        <w:spacing w:line="312" w:lineRule="auto" w:after="80"/>
-        <w:jc w:val="both"/>
-      </w:pPr>
-      <w:r>
-        <w:rPr>
-          <w:rFonts w:ascii="Times New Roman" w:hAnsi="Times New Roman"/>
-          <w:sz w:val="26"/>
-        </w:rPr>
-        <w:t>Итог. Создан полный рабочий конвейер — от обработки снимка до проверки результата по метео и судовым данным. Собран первый трёхклассовый датасет для российской Арктики, достигнуто F1 0.89 — выше всех аналогов, а метод проверен на четырёх портах. Система готова к практическому мониторингу. Спасибо за внимание, готов ответить на вопросы.</w:t>
+        <w:t>Научная новизна состоит в трёх вещах: первый трёхклассовый датасет для российской Арктики с отдельным классом льда; адаптация DeepLabV3+ под одноканальный радар; и первая количественная оценка переноса модели между портами. По метрике F1 мой метод превосходит все аналоги из литературы. В итоге создан полный рабочий конвейер — от обработки снимка до проверки по метео и судовым данным — готовый к мониторингу четырёх арктических акваторий России. Спасибо за внимание, готов ответить на вопросы.</w:t>
       </w:r>
     </w:p>
     <w:sectPr>

</xml_diff>